<commit_message>
feat(arch): implement multi-crew autonomous trading framework and post-market safety wall
- Implement 5-crew architecture: PreMarketCrew, ScannerCrew, TradingCrew (with OrderFlowAgent), ExecutionCrew, and PostMarketCrew
- Implement Capital Safety Wall lock mechanism (50% daily reserve lock & institutional scaling)
- Add OrderFlowAgent for institutional bid/ask imbalances, iceberg absorption, and delta confluence
- Modularize live scanner with autonomous crew pipelines and post-market audit automation
- Add daily reporting orchestrator, risk configurations, and state persistence
- Update architecture documentation, SVG/PNG diagrams, PDFs, and documentation exports
- Add full test suite for multi-crew trading workflows
</commit_message>
<xml_diff>
--- a/DocumentsAndDiagrams/docx/DATABASE_TABLE_REFERENCE.docx
+++ b/DocumentsAndDiagrams/docx/DATABASE_TABLE_REFERENCE.docx
@@ -909,6 +909,68 @@
           <w:spacing w:val="0"/>
           <w:color w:val="151312"/>
         </w:rPr>
+        <w:t xml:space="preserve">notifications</w:t>
+      </w:r>
+      <w:r>
+        <w:rPr>
+          <w:rFonts w:ascii="Helvetica" w:hAnsi="Helvetica" w:cs="Helvetica"/>
+          <w:sz w:val="25"/>
+          <w:sz-cs w:val="25"/>
+          <w:spacing w:val="0"/>
+          <w:color w:val="151312"/>
+        </w:rPr>
+        <w:t xml:space="preserve"/>
+      </w:r>
+    </w:p>
+    <w:p>
+      <w:pPr/>
+      <w:r>
+        <w:rPr>
+          <w:rFonts w:ascii="Helvetica" w:hAnsi="Helvetica" w:cs="Helvetica"/>
+          <w:sz w:val="25"/>
+          <w:sz-cs w:val="25"/>
+          <w:spacing w:val="0"/>
+          <w:color w:val="151312"/>
+        </w:rPr>
+        <w:t xml:space="preserve">Research</w:t>
+      </w:r>
+    </w:p>
+    <w:p>
+      <w:pPr/>
+      <w:r>
+        <w:rPr>
+          <w:rFonts w:ascii="Helvetica" w:hAnsi="Helvetica" w:cs="Helvetica"/>
+          <w:sz w:val="25"/>
+          <w:sz-cs w:val="25"/>
+          <w:spacing w:val="0"/>
+          <w:color w:val="151312"/>
+        </w:rPr>
+        <w:t xml:space="preserve">Alerts and notifications log for audit and reassessment</w:t>
+      </w:r>
+    </w:p>
+    <w:p>
+      <w:pPr/>
+      <w:r>
+        <w:rPr>
+          <w:rFonts w:ascii="Helvetica" w:hAnsi="Helvetica" w:cs="Helvetica"/>
+          <w:sz w:val="25"/>
+          <w:sz-cs w:val="25"/>
+          <w:spacing w:val="0"/>
+          <w:color w:val="151312"/>
+        </w:rPr>
+        <w:t xml:space="preserve">Alerts / Inbox</w:t>
+      </w:r>
+    </w:p>
+    <w:p>
+      <w:pPr/>
+      <w:r>
+        <w:rPr>
+          <w:rFonts w:ascii=".AppleSystemUIFontMonospaced" w:hAnsi=".AppleSystemUIFontMonospaced" w:cs=".AppleSystemUIFontMonospaced"/>
+          <w:sz w:val="23"/>
+          <w:sz-cs w:val="23"/>
+          <w:spacing w:val="0"/>
+          <w:color w:val="151312"/>
+        </w:rPr>
         <w:t xml:space="preserve">audit_events</w:t>
       </w:r>
       <w:r>
@@ -5134,6 +5196,297 @@
           <w:color w:val="151312"/>
         </w:rPr>
         <w:t xml:space="preserve">).</w:t>
+      </w:r>
+    </w:p>
+    <w:p>
+      <w:pPr>
+        <w:spacing w:after="280"/>
+      </w:pPr>
+      <w:r>
+        <w:rPr>
+          <w:rFonts w:ascii="Helvetica" w:hAnsi="Helvetica" w:cs="Helvetica"/>
+          <w:sz w:val="28"/>
+          <w:sz-cs w:val="28"/>
+          <w:b/>
+          <w:spacing w:val="0"/>
+          <w:color w:val="151312"/>
+        </w:rPr>
+        <w:t xml:space="preserve">notifications</w:t>
+      </w:r>
+    </w:p>
+    <w:p>
+      <w:pPr>
+        <w:spacing w:after="250"/>
+      </w:pPr>
+      <w:r>
+        <w:rPr>
+          <w:rFonts w:ascii="Helvetica" w:hAnsi="Helvetica" w:cs="Helvetica"/>
+          <w:sz w:val="25"/>
+          <w:sz-cs w:val="25"/>
+          <w:spacing w:val="0"/>
+          <w:color w:val="151312"/>
+        </w:rPr>
+        <w:t xml:space="preserve">Alerts and system notifications dispatched to external channels (Telegram, SMTP) and in-app notifications. Preserved for operational reassessment and audit. </w:t>
+      </w:r>
+      <w:r>
+        <w:rPr>
+          <w:rFonts w:ascii=".AppleSystemUIFontMonospaced" w:hAnsi=".AppleSystemUIFontMonospaced" w:cs=".AppleSystemUIFontMonospaced"/>
+          <w:sz w:val="23"/>
+          <w:sz-cs w:val="23"/>
+          <w:spacing w:val="0"/>
+          <w:color w:val="151312"/>
+        </w:rPr>
+        <w:t xml:space="preserve">NoDelete</w:t>
+      </w:r>
+      <w:r>
+        <w:rPr>
+          <w:rFonts w:ascii="Helvetica" w:hAnsi="Helvetica" w:cs="Helvetica"/>
+          <w:sz w:val="25"/>
+          <w:sz-cs w:val="25"/>
+          <w:spacing w:val="0"/>
+          <w:color w:val="151312"/>
+        </w:rPr>
+        <w:t xml:space="preserve"> blocks row deletion, while allowing </w:t>
+      </w:r>
+      <w:r>
+        <w:rPr>
+          <w:rFonts w:ascii=".AppleSystemUIFontMonospaced" w:hAnsi=".AppleSystemUIFontMonospaced" w:cs=".AppleSystemUIFontMonospaced"/>
+          <w:sz w:val="23"/>
+          <w:sz-cs w:val="23"/>
+          <w:spacing w:val="0"/>
+          <w:color w:val="151312"/>
+        </w:rPr>
+        <w:t xml:space="preserve">read_at</w:t>
+      </w:r>
+      <w:r>
+        <w:rPr>
+          <w:rFonts w:ascii="Helvetica" w:hAnsi="Helvetica" w:cs="Helvetica"/>
+          <w:sz w:val="25"/>
+          <w:sz-cs w:val="25"/>
+          <w:spacing w:val="0"/>
+          <w:color w:val="151312"/>
+        </w:rPr>
+        <w:t xml:space="preserve"> status updates.</w:t>
+      </w:r>
+    </w:p>
+    <w:p>
+      <w:pPr>
+        <w:ind w:left="720" w:first-line="-720"/>
+      </w:pPr>
+      <w:r>
+        <w:rPr>
+          <w:rFonts w:ascii="Helvetica" w:hAnsi="Helvetica" w:cs="Helvetica"/>
+          <w:sz w:val="25"/>
+          <w:sz-cs w:val="25"/>
+          <w:b/>
+          <w:color w:val="151312"/>
+        </w:rPr>
+        <w:t xml:space="preserve"/>
+        <w:tab/>
+        <w:t xml:space="preserve">•</w:t>
+        <w:tab/>
+        <w:t xml:space="preserve"/>
+      </w:r>
+      <w:r>
+        <w:rPr>
+          <w:rFonts w:ascii="Helvetica" w:hAnsi="Helvetica" w:cs="Helvetica"/>
+          <w:sz w:val="25"/>
+          <w:sz-cs w:val="25"/>
+          <w:b/>
+          <w:spacing w:val="0"/>
+          <w:color w:val="151312"/>
+        </w:rPr>
+        <w:t xml:space="preserve">Written by:</w:t>
+      </w:r>
+      <w:r>
+        <w:rPr>
+          <w:rFonts w:ascii="Helvetica" w:hAnsi="Helvetica" w:cs="Helvetica"/>
+          <w:sz w:val="25"/>
+          <w:sz-cs w:val="25"/>
+          <w:spacing w:val="0"/>
+          <w:color w:val="151312"/>
+        </w:rPr>
+        <w:t xml:space="preserve"> </w:t>
+      </w:r>
+      <w:r>
+        <w:rPr>
+          <w:rFonts w:ascii=".AppleSystemUIFontMonospaced" w:hAnsi=".AppleSystemUIFontMonospaced" w:cs=".AppleSystemUIFontMonospaced"/>
+          <w:sz w:val="23"/>
+          <w:sz-cs w:val="23"/>
+          <w:spacing w:val="0"/>
+          <w:color w:val="151312"/>
+        </w:rPr>
+        <w:t xml:space="preserve">backend/app/alerts.py</w:t>
+      </w:r>
+      <w:r>
+        <w:rPr>
+          <w:rFonts w:ascii="Helvetica" w:hAnsi="Helvetica" w:cs="Helvetica"/>
+          <w:sz w:val="25"/>
+          <w:sz-cs w:val="25"/>
+          <w:spacing w:val="0"/>
+          <w:color w:val="151312"/>
+        </w:rPr>
+        <w:t xml:space="preserve"> (</w:t>
+      </w:r>
+      <w:r>
+        <w:rPr>
+          <w:rFonts w:ascii=".AppleSystemUIFontMonospaced" w:hAnsi=".AppleSystemUIFontMonospaced" w:cs=".AppleSystemUIFontMonospaced"/>
+          <w:sz w:val="23"/>
+          <w:sz-cs w:val="23"/>
+          <w:spacing w:val="0"/>
+          <w:color w:val="151312"/>
+        </w:rPr>
+        <w:t xml:space="preserve">notify</w:t>
+      </w:r>
+      <w:r>
+        <w:rPr>
+          <w:rFonts w:ascii="Helvetica" w:hAnsi="Helvetica" w:cs="Helvetica"/>
+          <w:sz w:val="25"/>
+          <w:sz-cs w:val="25"/>
+          <w:spacing w:val="0"/>
+          <w:color w:val="151312"/>
+        </w:rPr>
+        <w:t xml:space="preserve">, </w:t>
+      </w:r>
+      <w:r>
+        <w:rPr>
+          <w:rFonts w:ascii=".AppleSystemUIFontMonospaced" w:hAnsi=".AppleSystemUIFontMonospaced" w:cs=".AppleSystemUIFontMonospaced"/>
+          <w:sz w:val="23"/>
+          <w:sz-cs w:val="23"/>
+          <w:spacing w:val="0"/>
+          <w:color w:val="151312"/>
+        </w:rPr>
+        <w:t xml:space="preserve">record</w:t>
+      </w:r>
+      <w:r>
+        <w:rPr>
+          <w:rFonts w:ascii="Helvetica" w:hAnsi="Helvetica" w:cs="Helvetica"/>
+          <w:sz w:val="25"/>
+          <w:sz-cs w:val="25"/>
+          <w:spacing w:val="0"/>
+          <w:color w:val="151312"/>
+        </w:rPr>
+        <w:t xml:space="preserve">) and </w:t>
+      </w:r>
+      <w:r>
+        <w:rPr>
+          <w:rFonts w:ascii=".AppleSystemUIFontMonospaced" w:hAnsi=".AppleSystemUIFontMonospaced" w:cs=".AppleSystemUIFontMonospaced"/>
+          <w:sz w:val="23"/>
+          <w:sz-cs w:val="23"/>
+          <w:spacing w:val="0"/>
+          <w:color w:val="151312"/>
+        </w:rPr>
+        <w:t xml:space="preserve">POST /api/notifications</w:t>
+      </w:r>
+      <w:r>
+        <w:rPr>
+          <w:rFonts w:ascii="Helvetica" w:hAnsi="Helvetica" w:cs="Helvetica"/>
+          <w:sz w:val="25"/>
+          <w:sz-cs w:val="25"/>
+          <w:spacing w:val="0"/>
+          <w:color w:val="151312"/>
+        </w:rPr>
+        <w:t xml:space="preserve">.</w:t>
+      </w:r>
+    </w:p>
+    <w:p>
+      <w:pPr>
+        <w:ind w:left="720" w:first-line="-720"/>
+      </w:pPr>
+      <w:r>
+        <w:rPr>
+          <w:rFonts w:ascii="Helvetica" w:hAnsi="Helvetica" w:cs="Helvetica"/>
+          <w:sz w:val="25"/>
+          <w:sz-cs w:val="25"/>
+          <w:b/>
+          <w:color w:val="151312"/>
+        </w:rPr>
+        <w:t xml:space="preserve"/>
+        <w:tab/>
+        <w:t xml:space="preserve">•</w:t>
+        <w:tab/>
+        <w:t xml:space="preserve"/>
+      </w:r>
+      <w:r>
+        <w:rPr>
+          <w:rFonts w:ascii="Helvetica" w:hAnsi="Helvetica" w:cs="Helvetica"/>
+          <w:sz w:val="25"/>
+          <w:sz-cs w:val="25"/>
+          <w:b/>
+          <w:spacing w:val="0"/>
+          <w:color w:val="151312"/>
+        </w:rPr>
+        <w:t xml:space="preserve">Read by:</w:t>
+      </w:r>
+      <w:r>
+        <w:rPr>
+          <w:rFonts w:ascii="Helvetica" w:hAnsi="Helvetica" w:cs="Helvetica"/>
+          <w:sz w:val="25"/>
+          <w:sz-cs w:val="25"/>
+          <w:spacing w:val="0"/>
+          <w:color w:val="151312"/>
+        </w:rPr>
+        <w:t xml:space="preserve"> </w:t>
+      </w:r>
+      <w:r>
+        <w:rPr>
+          <w:rFonts w:ascii=".AppleSystemUIFontMonospaced" w:hAnsi=".AppleSystemUIFontMonospaced" w:cs=".AppleSystemUIFontMonospaced"/>
+          <w:sz w:val="23"/>
+          <w:sz-cs w:val="23"/>
+          <w:spacing w:val="0"/>
+          <w:color w:val="151312"/>
+        </w:rPr>
+        <w:t xml:space="preserve">GET /api/notifications</w:t>
+      </w:r>
+      <w:r>
+        <w:rPr>
+          <w:rFonts w:ascii="Helvetica" w:hAnsi="Helvetica" w:cs="Helvetica"/>
+          <w:sz w:val="25"/>
+          <w:sz-cs w:val="25"/>
+          <w:spacing w:val="0"/>
+          <w:color w:val="151312"/>
+        </w:rPr>
+        <w:t xml:space="preserve">, updated by </w:t>
+      </w:r>
+      <w:r>
+        <w:rPr>
+          <w:rFonts w:ascii=".AppleSystemUIFontMonospaced" w:hAnsi=".AppleSystemUIFontMonospaced" w:cs=".AppleSystemUIFontMonospaced"/>
+          <w:sz w:val="23"/>
+          <w:sz-cs w:val="23"/>
+          <w:spacing w:val="0"/>
+          <w:color w:val="151312"/>
+        </w:rPr>
+        <w:t xml:space="preserve">POST /api/notifications/{id}/read</w:t>
+      </w:r>
+      <w:r>
+        <w:rPr>
+          <w:rFonts w:ascii="Helvetica" w:hAnsi="Helvetica" w:cs="Helvetica"/>
+          <w:sz w:val="25"/>
+          <w:sz-cs w:val="25"/>
+          <w:spacing w:val="0"/>
+          <w:color w:val="151312"/>
+        </w:rPr>
+        <w:t xml:space="preserve"> and </w:t>
+      </w:r>
+      <w:r>
+        <w:rPr>
+          <w:rFonts w:ascii=".AppleSystemUIFontMonospaced" w:hAnsi=".AppleSystemUIFontMonospaced" w:cs=".AppleSystemUIFontMonospaced"/>
+          <w:sz w:val="23"/>
+          <w:sz-cs w:val="23"/>
+          <w:spacing w:val="0"/>
+          <w:color w:val="151312"/>
+        </w:rPr>
+        <w:t xml:space="preserve">POST /api/notifications/read-all</w:t>
+      </w:r>
+      <w:r>
+        <w:rPr>
+          <w:rFonts w:ascii="Helvetica" w:hAnsi="Helvetica" w:cs="Helvetica"/>
+          <w:sz w:val="25"/>
+          <w:sz-cs w:val="25"/>
+          <w:spacing w:val="0"/>
+          <w:color w:val="151312"/>
+        </w:rPr>
+        <w:t xml:space="preserve">.</w:t>
       </w:r>
     </w:p>
     <w:p>

</xml_diff>